<commit_message>
Reactivacion de octubre: etiqueta y plantillas referencian Halloween (sin 'ultimo grupo del ano')
Co-Authored-By: Claude Fable 5.1 <noreply@anthropic.com>
</commit_message>
<xml_diff>
--- a/recursos/comercial/plataforma LaHaus/MENSAJE_JAIDER_REACTIVACION_2026-10-21.docx
+++ b/recursos/comercial/plataforma LaHaus/MENSAJE_JAIDER_REACTIVACION_2026-10-21.docx
@@ -96,7 +96,7 @@
         <w:t>Hola {{cName}}, soy el asistente de Heiiu. Hace un tiempo nos escribiste por el inglés y la conversación se quedó ahí.</w:t>
         <w:br/>
         <w:br/>
-        <w:t>Te lo decimos de frente, que para eso es octubre: lo que debería darte miedo no es el inglés, es perder la oportunidad. La entrevista, el viaje o el cliente de afuera llegan igual, con o sin él.</w:t>
+        <w:t>Este Halloween te lo decimos de frente: lo que debería darte miedo no es el inglés, es perder la oportunidad. La entrevista, el viaje o el cliente de afuera llegan igual, con o sin él.</w:t>
         <w:br/>
         <w:br/>
         <w:t>El último grupo del año arranca en noviembre y todavía hay cupo, con garantía de aprendizaje por escrito. ¿Lo retomamos?</w:t>
@@ -128,7 +128,7 @@
         <w:t>Hola {{cName}}, soy el asistente de Heiiu. Hace un tiempo nos escribiste por el inglés y la conversación se quedó ahí.</w:t>
         <w:br/>
         <w:br/>
-        <w:t>Que no te dé miedo hablar inglés: aquí se habla desde la primera clase, en grupos pequeños y con un profesor al lado que te corrige ahí mismo.</w:t>
+        <w:t>Este Halloween, que no te dé miedo hablar inglés: aquí se habla desde la primera clase, en grupos pequeños y con un profesor al lado que te corrige ahí mismo.</w:t>
         <w:br/>
         <w:br/>
         <w:t>El último grupo del año arranca en noviembre y todavía hay cupo, con garantía de aprendizaje por escrito. ¿Lo retomamos?</w:t>

</xml_diff>

<commit_message>
Mensaje a Jaider: plantillas finales (Louissiana, grupo nuevo en noviembre, maximo 16, pie BAJA de 60 caracteres, nombre invalido sin nombre, fecha a la asesora, RNE)
Co-Authored-By: Claude Fable 5.1 <noreply@anthropic.com>
</commit_message>
<xml_diff>
--- a/recursos/comercial/plataforma LaHaus/MENSAJE_JAIDER_REACTIVACION_2026-10-21.docx
+++ b/recursos/comercial/plataforma LaHaus/MENSAJE_JAIDER_REACTIVACION_2026-10-21.docx
@@ -93,13 +93,13 @@
           <w:i w:val="0"/>
           <w:sz w:val="20"/>
         </w:rPr>
-        <w:t>Hola {{cName}}, soy el asistente de Heiiu. Hace un tiempo nos escribiste por el inglés y la conversación se quedó ahí.</w:t>
+        <w:t>Hola {{cName}}, soy Louissiana, la asistente de Heiiu. Hace un tiempo nos escribiste por el inglés y la conversación se quedó ahí.</w:t>
         <w:br/>
         <w:br/>
         <w:t>Este Halloween te lo decimos de frente: lo que debería darte miedo no es el inglés, es perder la oportunidad. La entrevista, el viaje o el cliente de afuera llegan igual, con o sin él.</w:t>
         <w:br/>
         <w:br/>
-        <w:t>El último grupo del año arranca en noviembre y todavía hay cupo, con garantía de aprendizaje por escrito. ¿Para qué lo quieres: viajar, trabajar o estudiar?</w:t>
+        <w:t>En noviembre abre grupo nuevo y todavía hay cupo, con garantía de aprendizaje por escrito. ¿Para qué lo quieres: viajar, trabajar o estudiar? (Si es para tu negocio o para otra persona, escríbenos.)</w:t>
       </w:r>
     </w:p>
     <w:p>
@@ -125,13 +125,13 @@
           <w:i w:val="0"/>
           <w:sz w:val="20"/>
         </w:rPr>
-        <w:t>Hola {{cName}}, soy el asistente de Heiiu. Hace un tiempo nos escribiste por el inglés y la conversación se quedó ahí.</w:t>
+        <w:t>Hola {{cName}}, soy Louissiana, la asistente de Heiiu. Hace un tiempo nos escribiste por el inglés y la conversación se quedó ahí.</w:t>
         <w:br/>
         <w:br/>
-        <w:t>Este Halloween, que no te dé miedo hablar inglés: aquí se habla desde la primera clase, en grupos pequeños y con un profesor al lado que te corrige ahí mismo.</w:t>
+        <w:t>Este Halloween, que no te dé miedo hablar inglés: aquí se habla desde la primera clase, en grupos de máximo 16 y con un profesor al lado que te corrige ahí mismo.</w:t>
         <w:br/>
         <w:br/>
-        <w:t>El último grupo del año arranca en noviembre y todavía hay cupo, con garantía de aprendizaje por escrito. ¿Para qué lo quieres: viajar, trabajar o estudiar?</w:t>
+        <w:t>En noviembre abre grupo nuevo y todavía hay cupo, con garantía de aprendizaje por escrito. ¿Para qué lo quieres: viajar, trabajar o estudiar? (Si es para tu negocio o para otra persona, escríbenos.)</w:t>
       </w:r>
     </w:p>
     <w:p>
@@ -158,7 +158,7 @@
           <w:color w:val="666666"/>
           <w:sz w:val="19"/>
         </w:rPr>
-        <w:t>Línea final de la plantilla: "Si es para tu negocio o para otra persona, escríbenos. Si no quieres recibir más mensajes, responde BAJA."</w:t>
+        <w:t>Pie de la plantilla (el campo "footer" de Meta admite máximo 60 caracteres): "Responde BAJA para no recibir más mensajes."</w:t>
       </w:r>
     </w:p>
     <w:p>
@@ -172,7 +172,7 @@
           <w:color w:val="666666"/>
           <w:sz w:val="19"/>
         </w:rPr>
-        <w:t>Las dos llevan los mismos botones y la misma línea de BAJA. Sin nombre de programa, sin precio, sin "descuento", "gratis" ni "fácil". La imagen va arriba, como en los ejemplos que me mandaste.</w:t>
+        <w:t>Las dos llevan los mismos botones y el mismo pie. Sin nombre de programa, sin precio, sin "descuento", "gratis" ni "fácil". La imagen va arriba, como en los ejemplos que me mandaste. Tres cosas de configuración: (a) si el nombre del contacto trae @, números, correo o más de tres palabras, la plantilla sale sin nombre ("Hola, soy Louissiana…"), como quedó pedido el 7/10; (b) si el lead pregunta la fecha exacta, el agente no la inventa: "la fecha y la jornada te las confirma la asesora en la cita"; (c) confírmame que la base pasa por el Registro de Números Excluidos antes del envío, o si eso lo tenemos que hacer nosotros.</w:t>
       </w:r>
     </w:p>
     <w:p>

</xml_diff>

<commit_message>
Mensaje a Jaider, punto 3: sin base adicional, sin 'estudiantes activos', 300 mas calientes de la reserva ahora dentro del tope y el resto en noviembre
Co-Authored-By: Claude Fable 5.1 <noreply@anthropic.com>
</commit_message>
<xml_diff>
--- a/recursos/comercial/plataforma LaHaus/MENSAJE_JAIDER_REACTIVACION_2026-10-21.docx
+++ b/recursos/comercial/plataforma LaHaus/MENSAJE_JAIDER_REACTIVACION_2026-10-21.docx
@@ -310,6 +310,7 @@
       <w:pPr>
         <w:spacing w:after="80"/>
         <w:rPr>
+          <w:color w:val="000000" w:themeColor="text1"/>
           <w:lang w:val="es-CO"/>
         </w:rPr>
       </w:pPr>
@@ -319,37 +320,28 @@
           <w:sz w:val="19"/>
           <w:lang w:val="es-CO"/>
         </w:rPr>
-        <w:t>Pie de la plantilla (el campo "</w:t>
+        <w:br/>
       </w:r>
-      <w:proofErr w:type="spellStart"/>
       <w:r>
         <w:rPr>
-          <w:color w:val="666666"/>
+          <w:color w:val="000000" w:themeColor="text1"/>
           <w:sz w:val="19"/>
           <w:lang w:val="es-CO"/>
         </w:rPr>
-        <w:t>footer</w:t>
-      </w:r>
-      <w:proofErr w:type="spellEnd"/>
-      <w:r>
-        <w:rPr>
-          <w:color w:val="666666"/>
-          <w:sz w:val="19"/>
-          <w:lang w:val="es-CO"/>
-        </w:rPr>
-        <w:t>" de Meta admite máximo 60 caracteres): "Responde BAJA para no recibir más mensajes."</w:t>
+        <w:t>"Responde BAJA para no recibir más mensajes."</w:t>
       </w:r>
     </w:p>
     <w:p>
       <w:pPr>
         <w:spacing w:after="120"/>
         <w:rPr>
+          <w:color w:val="000000" w:themeColor="text1"/>
           <w:lang w:val="es-CO"/>
         </w:rPr>
       </w:pPr>
       <w:r>
         <w:rPr>
-          <w:color w:val="666666"/>
+          <w:color w:val="000000" w:themeColor="text1"/>
           <w:sz w:val="19"/>
           <w:lang w:val="es-CO"/>
         </w:rPr>
@@ -358,7 +350,7 @@
       <w:proofErr w:type="gramStart"/>
       <w:r>
         <w:rPr>
-          <w:color w:val="666666"/>
+          <w:color w:val="000000" w:themeColor="text1"/>
           <w:sz w:val="19"/>
           <w:lang w:val="es-CO"/>
         </w:rPr>
@@ -367,7 +359,7 @@
       <w:proofErr w:type="gramEnd"/>
       <w:r>
         <w:rPr>
-          <w:color w:val="666666"/>
+          <w:color w:val="000000" w:themeColor="text1"/>
           <w:sz w:val="19"/>
           <w:lang w:val="es-CO"/>
         </w:rPr>
@@ -376,7 +368,7 @@
       <w:proofErr w:type="spellStart"/>
       <w:r>
         <w:rPr>
-          <w:color w:val="666666"/>
+          <w:color w:val="000000" w:themeColor="text1"/>
           <w:sz w:val="19"/>
           <w:lang w:val="es-CO"/>
         </w:rPr>
@@ -385,11 +377,19 @@
       <w:proofErr w:type="spellEnd"/>
       <w:r>
         <w:rPr>
-          <w:color w:val="666666"/>
+          <w:color w:val="000000" w:themeColor="text1"/>
           <w:sz w:val="19"/>
           <w:lang w:val="es-CO"/>
         </w:rPr>
-        <w:t>…"), como quedó pedido el 7/10; (b) si el lead pregunta la fecha exacta, el agente no la inventa: "la fecha y la jornada te las confirma la asesora en la cita"; (c) confírmame que la base pasa por el Registro de Números Excluidos antes del envío, o si eso lo tenemos que hacer nosotros.</w:t>
+        <w:t>…"), como quedó pedido el 7/10; (b) si el lead pregunta la fecha exacta, el agente no la inventa: "la fecha y la jornada te las confirma la asesora en la cita"; (c) confírmame que la base pasa por el Registro de Números Excluidos antes del envío</w:t>
+      </w:r>
+      <w:r>
+        <w:rPr>
+          <w:color w:val="000000" w:themeColor="text1"/>
+          <w:sz w:val="19"/>
+          <w:lang w:val="es-CO"/>
+        </w:rPr>
+        <w:t>?</w:t>
       </w:r>
     </w:p>
     <w:p>
@@ -507,36 +507,12 @@
         <w:rPr>
           <w:lang w:val="es-CO"/>
         </w:rPr>
-        <w:t xml:space="preserve">• Sí: una base adicional de [N] leads que te subo hoy (los que llegaron a agendar con el </w:t>
+        <w:t>• No: leads con cita agendada o asistida, los que dijeron que no o pidieron BAJA, y cualquier conversación con mensajes en los últimos 7 días (esa la termina el agente, no se pisa).</w:t>
       </w:r>
       <w:proofErr w:type="spellStart"/>
-      <w:r>
-        <w:rPr>
-          <w:lang w:val="es-CO"/>
-        </w:rPr>
-        <w:t>bot</w:t>
-      </w:r>
       <w:proofErr w:type="spellEnd"/>
-      <w:r>
-        <w:rPr>
-          <w:lang w:val="es-CO"/>
-        </w:rPr>
-        <w:t xml:space="preserve"> anterior y no se matricularon; la cruzamos nosotros con la lista de estudiantes). Mismo saludo.</w:t>
-      </w:r>
-    </w:p>
-    <w:p>
-      <w:pPr>
-        <w:spacing w:after="80"/>
-        <w:rPr>
-          <w:lang w:val="es-CO"/>
-        </w:rPr>
-      </w:pPr>
-      <w:r>
-        <w:rPr>
-          <w:lang w:val="es-CO"/>
-        </w:rPr>
-        <w:t>• No: estudiantes activos, leads con cita agendada o asistida, los que dijeron que no o pidieron BAJA, y cualquier conversación con mensajes en los últimos 7 días (esa la termina el agente, no se pisa).</w:t>
-      </w:r>
+      <w:proofErr w:type="spellStart"/>
+      <w:proofErr w:type="spellEnd"/>
     </w:p>
     <w:p>
       <w:pPr>
@@ -549,23 +525,12 @@
         <w:rPr>
           <w:lang w:val="es-CO"/>
         </w:rPr>
-        <w:lastRenderedPageBreak/>
-        <w:t xml:space="preserve">• La reserva grande (unos 1.500 del </w:t>
+        <w:t>• De la reserva del bot anterior (unos 1.500 leads que todavía no están en la plataforma) te subo hoy los 300 más calientes para que salgan en este mismo envío, si caben dentro del tope de 1.000 leads activos del mes sin costo adicional; dime cuántos caben exactamente. El resto sale el 2 o 3 de noviembre, cuando reinicie el conteo del mes, con la misma plantilla.</w:t>
       </w:r>
       <w:proofErr w:type="spellStart"/>
-      <w:r>
-        <w:rPr>
-          <w:lang w:val="es-CO"/>
-        </w:rPr>
-        <w:t>bot</w:t>
-      </w:r>
       <w:proofErr w:type="spellEnd"/>
-      <w:r>
-        <w:rPr>
-          <w:lang w:val="es-CO"/>
-        </w:rPr>
-        <w:t xml:space="preserve"> anterior) queda para la primera semana de noviembre, cuando reinicie el conteo del mes, con la misma plantilla y la fecha de noviembre.</w:t>
-      </w:r>
+      <w:proofErr w:type="gramStart"/>
+      <w:proofErr w:type="gramEnd"/>
     </w:p>
     <w:p>
       <w:pPr>

</xml_diff>

<commit_message>
Mensaje a Jaider: envio viernes 23, numeros el mismo viernes
Co-Authored-By: Claude Fable 5.1 <noreply@anthropic.com>
</commit_message>
<xml_diff>
--- a/recursos/comercial/plataforma LaHaus/MENSAJE_JAIDER_REACTIVACION_2026-10-21.docx
+++ b/recursos/comercial/plataforma LaHaus/MENSAJE_JAIDER_REACTIVACION_2026-10-21.docx
@@ -560,7 +560,7 @@
         <w:rPr>
           <w:lang w:val="es-CO"/>
         </w:rPr>
-        <w:t>• Hora: jueves 22 a las 9:00 a. m., dentro del horario legal. Si Meta no aprueba la plantilla a tiempo, se corre al viernes 23 a las 9:00; no se manda en la tarde.</w:t>
+        <w:t>• Hora: viernes 23 a las 9:00 a. m., dentro del horario legal. Si Meta no aprueba las plantillas a tiempo, se corre al lunes 26 a las 9:00; no se manda en la tarde.</w:t>
       </w:r>
     </w:p>
     <w:p>
@@ -588,7 +588,7 @@
         <w:rPr>
           <w:lang w:val="es-CO"/>
         </w:rPr>
-        <w:t>• Lo que te pido para la reunión de mañana a las 10:00: cuántos se enviaron, cuántos entregados, cuántos respondieron por botón y por texto, y cuántas citas, separado por plantilla (A y B) y aparte de pauta.</w:t>
+        <w:t>• Lo que te pido el mismo viernes en la tarde: cuántos se enviaron, cuántos entregados, cuántos respondieron por botón y por texto, y cuántas citas, separado por plantilla (A y B) y aparte de pauta.</w:t>
       </w:r>
     </w:p>
     <w:p>
@@ -619,7 +619,7 @@
         <w:rPr>
           <w:lang w:val="es-CO"/>
         </w:rPr>
-        <w:t>Cuando el agente recibe algo que no está en el flujo (dos preguntas a la vez, un cálculo, una petición rara), nunca reinicia la conversación ni vuelve a pedir el nombre. Responde "eso te lo resuelve la asesora, te la paso ahora", manda la notificación y conserva el contexto. Un lead que ya dio toda su información y recibe "¿con quién tengo el gusto?" se pierde. Lo revisamos mañana con el resto.</w:t>
+        <w:t>Cuando el agente recibe algo que no está en el flujo (dos preguntas a la vez, un cálculo, una petición rara), nunca reinicia la conversación ni vuelve a pedir el nombre. Responde "eso te lo resuelve la asesora, te la paso ahora", manda la notificación y conserva el contexto. Un lead que ya dio toda su información y recibe "¿con quién tengo el gusto?" se pierde. Lo revisamos en la próxima reunión con el resto.</w:t>
       </w:r>
     </w:p>
     <w:p>

</xml_diff>

<commit_message>
Mensaje a Jaider: rojos de gerencia (viernes y no domingo, barridos con el gerente de alianzas, dos numeros el viernes y el resto el lunes, regla del reinicio como caso ajeno, exclusion de 73)
Co-Authored-By: Claude Fable 5.1 <noreply@anthropic.com>
</commit_message>
<xml_diff>
--- a/recursos/comercial/plataforma LaHaus/MENSAJE_JAIDER_REACTIVACION_2026-10-21.docx
+++ b/recursos/comercial/plataforma LaHaus/MENSAJE_JAIDER_REACTIVACION_2026-10-21.docx
@@ -44,21 +44,7 @@
           <w:lang w:val="es-CO"/>
         </w:rPr>
         <w:br/>
-        <w:t xml:space="preserve">Para seguir probando que nos funciona hice dos imágenes y dos </w:t>
-      </w:r>
-      <w:proofErr w:type="gramStart"/>
-      <w:r>
-        <w:rPr>
-          <w:lang w:val="es-CO"/>
-        </w:rPr>
-        <w:t>plantillas  para</w:t>
-      </w:r>
-      <w:proofErr w:type="gramEnd"/>
-      <w:r>
-        <w:rPr>
-          <w:lang w:val="es-CO"/>
-        </w:rPr>
-        <w:t xml:space="preserve"> repartir alternando en la lista asi la prueba del flujo no se mezcla. Se mide por plantilla: botones, respuesta por texto y citas. </w:t>
+        <w:t xml:space="preserve">Para seguir probando que nos funciona hice dos imágenes y dos plantillas  para repartir alternando en la lista asi la prueba del flujo no se mezcla. Se mide por plantilla: botones, respuesta por texto y citas. </w:t>
       </w:r>
       <w:r>
         <w:rPr>
@@ -163,21 +149,7 @@
           <w:lang w:val="es-CO"/>
         </w:rPr>
         <w:br/>
-        <w:t xml:space="preserve">En noviembre abre grupo nuevo y todavía hay cupo, con garantía de aprendizaje por escrito. ¿Para qué lo quieres: </w:t>
-      </w:r>
-      <w:proofErr w:type="gramStart"/>
-      <w:r>
-        <w:rPr>
-          <w:lang w:val="es-CO"/>
-        </w:rPr>
-        <w:t>viajar, trabajar o estudiar?</w:t>
-      </w:r>
-      <w:proofErr w:type="gramEnd"/>
-      <w:r>
-        <w:rPr>
-          <w:lang w:val="es-CO"/>
-        </w:rPr>
-        <w:t xml:space="preserve"> (Si es para tu negocio o para otra persona, escríbenos.)</w:t>
+        <w:t>En noviembre abre grupo nuevo y todavía hay cupo, con garantía de aprendizaje por escrito. ¿Para qué lo quieres: viajar, trabajar o estudiar? (Si es para tu negocio o para otra persona, escríbenos.)</w:t>
       </w:r>
     </w:p>
     <w:p>
@@ -274,21 +246,7 @@
           <w:lang w:val="es-CO"/>
         </w:rPr>
         <w:br/>
-        <w:t xml:space="preserve">En noviembre abre grupo nuevo y todavía hay cupo, con garantía de aprendizaje por escrito. ¿Para qué lo quieres: </w:t>
-      </w:r>
-      <w:proofErr w:type="gramStart"/>
-      <w:r>
-        <w:rPr>
-          <w:lang w:val="es-CO"/>
-        </w:rPr>
-        <w:t>viajar, trabajar o estudiar?</w:t>
-      </w:r>
-      <w:proofErr w:type="gramEnd"/>
-      <w:r>
-        <w:rPr>
-          <w:lang w:val="es-CO"/>
-        </w:rPr>
-        <w:t xml:space="preserve"> (Si es para tu negocio o para otra persona, escríbenos.)</w:t>
+        <w:t>En noviembre abre grupo nuevo y todavía hay cupo, con garantía de aprendizaje por escrito. ¿Para qué lo quieres: viajar, trabajar o estudiar? (Si es para tu negocio o para otra persona, escríbenos.)</w:t>
       </w:r>
     </w:p>
     <w:p>
@@ -345,25 +303,7 @@
           <w:sz w:val="19"/>
           <w:lang w:val="es-CO"/>
         </w:rPr>
-        <w:t xml:space="preserve">Las dos llevan los </w:t>
-      </w:r>
-      <w:proofErr w:type="gramStart"/>
-      <w:r>
-        <w:rPr>
-          <w:color w:val="000000" w:themeColor="text1"/>
-          <w:sz w:val="19"/>
-          <w:lang w:val="es-CO"/>
-        </w:rPr>
-        <w:t>mismos botones y el mismo pie</w:t>
-      </w:r>
-      <w:proofErr w:type="gramEnd"/>
-      <w:r>
-        <w:rPr>
-          <w:color w:val="000000" w:themeColor="text1"/>
-          <w:sz w:val="19"/>
-          <w:lang w:val="es-CO"/>
-        </w:rPr>
-        <w:t xml:space="preserve">. Sin nombre de programa, sin precio, sin "descuento", "gratis" ni "fácil". La imagen va arriba, como en los ejemplos que me mandaste. Tres cosas de configuración: (a) si el nombre del contacto trae @, números, correo o más de tres palabras, la plantilla sale sin nombre ("Hola, soy </w:t>
+        <w:t xml:space="preserve">Las dos llevan los mismos botones y el mismo pie. Sin nombre de programa, sin precio, sin "descuento", "gratis" ni "fácil". La imagen va arriba, como en los ejemplos que me mandaste. Tres cosas de configuración: (a) si el nombre del contacto trae @, números, correo o más de tres palabras, la plantilla sale sin nombre ("Hola, soy </w:t>
       </w:r>
       <w:proofErr w:type="spellStart"/>
       <w:r>
@@ -509,10 +449,20 @@
         </w:rPr>
         <w:t>• No: leads con cita agendada o asistida, los que dijeron que no o pidieron BAJA, y cualquier conversación con mensajes en los últimos 7 días (esa la termina el agente, no se pisa).</w:t>
       </w:r>
-      <w:proofErr w:type="spellStart"/>
-      <w:proofErr w:type="spellEnd"/>
-      <w:proofErr w:type="spellStart"/>
-      <w:proofErr w:type="spellEnd"/>
+    </w:p>
+    <w:p>
+      <w:pPr>
+        <w:spacing w:after="80"/>
+        <w:rPr>
+          <w:lang w:val="es-CO"/>
+        </w:rPr>
+      </w:pPr>
+      <w:r>
+        <w:rPr>
+          <w:lang w:val="es-CO"/>
+        </w:rPr>
+        <w:t>• Además te adjunto un archivo con 73 teléfonos que se excluyen de este envío: son leads que conversaron y se enfriaron, y los está trabajando por llamada nuestro gerente de alianzas desde hoy.</w:t>
+      </w:r>
     </w:p>
     <w:p>
       <w:pPr>
@@ -525,12 +475,9 @@
         <w:rPr>
           <w:lang w:val="es-CO"/>
         </w:rPr>
+        <w:lastRenderedPageBreak/>
         <w:t>• De la reserva del bot anterior (unos 1.500 leads que todavía no están en la plataforma) te subo hoy los 300 más calientes para que salgan en este mismo envío, si caben dentro del tope de 1.000 leads activos del mes sin costo adicional; dime cuántos caben exactamente. El resto sale el 2 o 3 de noviembre, cuando reinicie el conteo del mes, con la misma plantilla.</w:t>
       </w:r>
-      <w:proofErr w:type="spellStart"/>
-      <w:proofErr w:type="spellEnd"/>
-      <w:proofErr w:type="gramStart"/>
-      <w:proofErr w:type="gramEnd"/>
     </w:p>
     <w:p>
       <w:pPr>
@@ -553,6 +500,7 @@
       <w:pPr>
         <w:spacing w:after="80"/>
         <w:rPr>
+          <w:color w:val="EE0000"/>
           <w:lang w:val="es-CO"/>
         </w:rPr>
       </w:pPr>
@@ -560,13 +508,14 @@
         <w:rPr>
           <w:lang w:val="es-CO"/>
         </w:rPr>
-        <w:t>• Hora: viernes 23 a las 9:00 a. m., dentro del horario legal. Si Meta no aprueba las plantillas a tiempo, se corre al lunes 26 a las 9:00; no se manda en la tarde.</w:t>
+        <w:t>• Hora: viernes 23 a las 9:00 a. m. Domingo no: nuestra regla de contacto es la de la ley, lunes a viernes de 7 a. m. a 7 p. m. y sábados hasta las 3 p. m., nunca domingos ni festivos. El fin de semana lo cubre el agente, que agenda él mismo, y nuestro equipo hace barridos el viernes y el sábado; lo que responda y no agende queda en una lista para llamarlo el lunes. Si Meta no aprueba las plantillas a tiempo, se corre al lunes 26 a las 9:00; no se manda en la tarde.</w:t>
       </w:r>
     </w:p>
     <w:p>
       <w:pPr>
         <w:spacing w:after="80"/>
         <w:rPr>
+          <w:color w:val="EE0000"/>
           <w:lang w:val="es-CO"/>
         </w:rPr>
       </w:pPr>
@@ -574,13 +523,14 @@
         <w:rPr>
           <w:lang w:val="es-CO"/>
         </w:rPr>
-        <w:t>• Nuestra asesora hace barridos a las 12:00 y a las 6:00 p. m. en el filtro de contacto humano y en las conversaciones que se quedaron a mitad de flujo. Lo que se cae a mitad de camino lo llama ella el mismo día.</w:t>
+        <w:t>• Nuestra asesora y nuestro gerente de alianzas hacen barridos el viernes a las 12:00 y a las 6:00 p. m. y el sábado a las 10:00 a. m. y a la 1:00 p. m., en el filtro de contacto humano y en las conversaciones que se quedaron a mitad de flujo. Lo que se cae a mitad de camino lo llama uno de ellos el mismo día.</w:t>
       </w:r>
     </w:p>
     <w:p>
       <w:pPr>
         <w:spacing w:after="120"/>
         <w:rPr>
+          <w:color w:val="EE0000"/>
           <w:lang w:val="es-CO"/>
         </w:rPr>
       </w:pPr>
@@ -588,7 +538,7 @@
         <w:rPr>
           <w:lang w:val="es-CO"/>
         </w:rPr>
-        <w:t>• Lo que te pido el mismo viernes en la tarde: cuántos se enviaron, cuántos entregados, cuántos respondieron por botón y por texto, y cuántas citas, separado por plantilla (A y B) y aparte de pauta.</w:t>
+        <w:t>• Lo que te pido el viernes en la tarde son solo dos números, los del panel: cuántos salieron y cuántos entregados, para saber ese mismo día que Meta no bloqueó ninguna plantilla y que el domingo no se nos vaya en vano. El lunes en la mañana el resto: cuántos respondieron por botón y por texto y cuántas citas, separado por plantilla (A y B) y aparte de pauta.</w:t>
       </w:r>
     </w:p>
     <w:p>
@@ -612,6 +562,7 @@
       <w:pPr>
         <w:spacing w:after="80"/>
         <w:rPr>
+          <w:color w:val="EE0000"/>
           <w:lang w:val="es-CO"/>
         </w:rPr>
       </w:pPr>
@@ -619,8 +570,14 @@
         <w:rPr>
           <w:lang w:val="es-CO"/>
         </w:rPr>
-        <w:t>Cuando el agente recibe algo que no está en el flujo (dos preguntas a la vez, un cálculo, una petición rara), nunca reinicia la conversación ni vuelve a pedir el nombre. Responde "eso te lo resuelve la asesora, te la paso ahora", manda la notificación y conserva el contexto. Un lead que ya dio toda su información y recibe "¿con quién tengo el gusto?" se pierde. Lo revisamos en la próxima reunión con el resto.</w:t>
+        <w:t>Esto no nos ha pasado con nuestro asistente; me pasó a mí como cliente con el agente de otra empresa y se me quedó en la cabeza. Cuando el agente recibe algo que no está en el flujo (dos preguntas a la vez, un cálculo, una petición rara), nunca reinicia la conversación ni vuelve a pedir el nombre. Responde "eso te lo resuelve la asesora, te la paso ahora", manda la notificación y conserva el contexto. Un lead que ya dio toda su información y recibe "¿con quién tengo el gusto?" se pierde. Lo revisamos en la próxima reunión con el resto.</w:t>
       </w:r>
+      <w:proofErr w:type="spellStart"/>
+      <w:proofErr w:type="spellEnd"/>
+      <w:proofErr w:type="spellStart"/>
+      <w:proofErr w:type="spellEnd"/>
+      <w:proofErr w:type="spellStart"/>
+      <w:proofErr w:type="spellEnd"/>
     </w:p>
     <w:p>
       <w:pPr>

</xml_diff>